<commit_message>
Actualizacion EDA y documentacion
</commit_message>
<xml_diff>
--- a/docs/preguntas_borrador.docx
+++ b/docs/preguntas_borrador.docx
@@ -48,7 +48,25 @@
           <w:sz w:val="22"/>
           <w:szCs w:val="22"/>
         </w:rPr>
-        <w:t xml:space="preserve">Qué factores </w:t>
+        <w:t>Qu</w:t>
+      </w:r>
+      <w:r>
+        <w:rPr>
+          <w:rFonts w:eastAsia="Arial" w:cs="Arial" w:ascii="Arial" w:hAnsi="Arial"/>
+          <w:color w:val="1F2937"/>
+          <w:sz w:val="22"/>
+          <w:szCs w:val="22"/>
+        </w:rPr>
+        <w:t>e</w:t>
+      </w:r>
+      <w:r>
+        <w:rPr>
+          <w:rFonts w:eastAsia="Arial" w:cs="Arial" w:ascii="Arial" w:hAnsi="Arial"/>
+          <w:color w:val="1F2937"/>
+          <w:sz w:val="22"/>
+          <w:szCs w:val="22"/>
+        </w:rPr>
+        <w:t xml:space="preserve"> factores </w:t>
       </w:r>
       <w:r>
         <w:rPr>
@@ -103,28 +121,6 @@
           <w:szCs w:val="22"/>
         </w:rPr>
         <w:t xml:space="preserve"> Argentina?</w:t>
-      </w:r>
-    </w:p>
-    <w:p>
-      <w:pPr>
-        <w:pStyle w:val="Normal"/>
-        <w:bidi w:val="0"/>
-        <w:spacing w:before="60" w:after="80"/>
-        <w:jc w:val="start"/>
-        <w:rPr>
-          <w:rFonts w:ascii="Arial" w:hAnsi="Arial" w:eastAsia="Arial" w:cs="Arial"/>
-          <w:color w:val="1F2937"/>
-          <w:sz w:val="22"/>
-          <w:szCs w:val="22"/>
-        </w:rPr>
-      </w:pPr>
-      <w:r>
-        <w:rPr>
-          <w:rFonts w:eastAsia="Arial" w:cs="Arial" w:ascii="Arial" w:hAnsi="Arial"/>
-          <w:color w:val="1F2937"/>
-          <w:sz w:val="22"/>
-          <w:szCs w:val="22"/>
-        </w:rPr>
       </w:r>
     </w:p>
     <w:p>

</xml_diff>